<commit_message>
Lab04: upgrade data layer with DI repository EF Core and transaction
</commit_message>
<xml_diff>
--- a/Labs_3/Lab_03.docx
+++ b/Labs_3/Lab_03.docx
@@ -65,6 +65,23 @@
         </w:rPr>
         <w:t>Link github:</w:t>
       </w:r>
+      <w:r>
+        <w:rPr>
+          <w:b/>
+          <w:bCs/>
+        </w:rPr>
+        <w:t xml:space="preserve"> </w:t>
+      </w:r>
+      <w:hyperlink r:id="rId5" w:history="1">
+        <w:r>
+          <w:rPr>
+            <w:rStyle w:val="Hyperlink"/>
+            <w:b/>
+            <w:bCs/>
+          </w:rPr>
+          <w:t>https://github.com/tin1508/Asp.Net_TTH/tree/main/Labs_3</w:t>
+        </w:r>
+      </w:hyperlink>
     </w:p>
     <w:p>
       <w:pPr>
@@ -125,6 +142,7 @@
         <w:rPr>
           <w:b/>
           <w:bCs/>
+          <w:noProof/>
           <w:sz w:val="32"/>
           <w:szCs w:val="32"/>
         </w:rPr>
@@ -144,7 +162,7 @@
                     <pic:cNvPicPr/>
                   </pic:nvPicPr>
                   <pic:blipFill>
-                    <a:blip r:embed="rId5"/>
+                    <a:blip r:embed="rId6"/>
                     <a:stretch>
                       <a:fillRect/>
                     </a:stretch>
@@ -193,6 +211,7 @@
         <w:rPr>
           <w:b/>
           <w:bCs/>
+          <w:noProof/>
           <w:sz w:val="32"/>
           <w:szCs w:val="32"/>
         </w:rPr>
@@ -212,7 +231,7 @@
                     <pic:cNvPicPr/>
                   </pic:nvPicPr>
                   <pic:blipFill>
-                    <a:blip r:embed="rId6"/>
+                    <a:blip r:embed="rId7"/>
                     <a:stretch>
                       <a:fillRect/>
                     </a:stretch>
@@ -274,6 +293,7 @@
         <w:rPr>
           <w:b/>
           <w:bCs/>
+          <w:noProof/>
         </w:rPr>
         <w:lastRenderedPageBreak/>
         <w:drawing>
@@ -292,7 +312,7 @@
                     <pic:cNvPicPr/>
                   </pic:nvPicPr>
                   <pic:blipFill>
-                    <a:blip r:embed="rId7"/>
+                    <a:blip r:embed="rId8"/>
                     <a:stretch>
                       <a:fillRect/>
                     </a:stretch>
@@ -330,6 +350,9 @@
     </w:p>
     <w:p>
       <w:r>
+        <w:rPr>
+          <w:noProof/>
+        </w:rPr>
         <w:drawing>
           <wp:inline distT="0" distB="0" distL="0" distR="0" wp14:anchorId="6FF2C903" wp14:editId="056668A9">
             <wp:extent cx="5654064" cy="2784143"/>
@@ -346,7 +369,7 @@
                     <pic:cNvPicPr/>
                   </pic:nvPicPr>
                   <pic:blipFill>
-                    <a:blip r:embed="rId8"/>
+                    <a:blip r:embed="rId9"/>
                     <a:stretch>
                       <a:fillRect/>
                     </a:stretch>
@@ -384,6 +407,9 @@
     </w:p>
     <w:p>
       <w:r>
+        <w:rPr>
+          <w:noProof/>
+        </w:rPr>
         <w:drawing>
           <wp:inline distT="0" distB="0" distL="0" distR="0" wp14:anchorId="7B38CB6E" wp14:editId="11F8FB19">
             <wp:extent cx="5693435" cy="2811439"/>
@@ -400,7 +426,7 @@
                     <pic:cNvPicPr/>
                   </pic:nvPicPr>
                   <pic:blipFill>
-                    <a:blip r:embed="rId9"/>
+                    <a:blip r:embed="rId10"/>
                     <a:stretch>
                       <a:fillRect/>
                     </a:stretch>
@@ -439,6 +465,9 @@
     </w:p>
     <w:p>
       <w:r>
+        <w:rPr>
+          <w:noProof/>
+        </w:rPr>
         <w:drawing>
           <wp:inline distT="0" distB="0" distL="0" distR="0" wp14:anchorId="4698EF7B" wp14:editId="52712EAF">
             <wp:extent cx="5443204" cy="2695432"/>
@@ -455,7 +484,7 @@
                     <pic:cNvPicPr/>
                   </pic:nvPicPr>
                   <pic:blipFill>
-                    <a:blip r:embed="rId10"/>
+                    <a:blip r:embed="rId11"/>
                     <a:stretch>
                       <a:fillRect/>
                     </a:stretch>
@@ -488,25 +517,14 @@
           <w:b/>
           <w:bCs/>
         </w:rPr>
-        <w:t>Trang /Stationeries/S</w:t>
-      </w:r>
-      <w:r>
-        <w:rPr>
-          <w:b/>
-          <w:bCs/>
-        </w:rPr>
-        <w:t>earch</w:t>
-      </w:r>
-      <w:r>
-        <w:rPr>
-          <w:b/>
-          <w:bCs/>
-        </w:rPr>
-        <w:t>:</w:t>
-      </w:r>
-    </w:p>
-    <w:p>
-      <w:r>
+        <w:t>Trang /Stationeries/Search:</w:t>
+      </w:r>
+    </w:p>
+    <w:p>
+      <w:r>
+        <w:rPr>
+          <w:noProof/>
+        </w:rPr>
         <w:drawing>
           <wp:inline distT="0" distB="0" distL="0" distR="0" wp14:anchorId="4C9694A6" wp14:editId="67A2568D">
             <wp:extent cx="5460052" cy="2688609"/>
@@ -523,7 +541,7 @@
                     <pic:cNvPicPr/>
                   </pic:nvPicPr>
                   <pic:blipFill>
-                    <a:blip r:embed="rId11"/>
+                    <a:blip r:embed="rId12"/>
                     <a:stretch>
                       <a:fillRect/>
                     </a:stretch>
@@ -581,6 +599,9 @@
     </w:p>
     <w:p>
       <w:r>
+        <w:rPr>
+          <w:noProof/>
+        </w:rPr>
         <w:drawing>
           <wp:inline distT="0" distB="0" distL="0" distR="0" wp14:anchorId="65E7AB2F" wp14:editId="77DC82B0">
             <wp:extent cx="5452281" cy="2698179"/>
@@ -597,7 +618,7 @@
                     <pic:cNvPicPr/>
                   </pic:nvPicPr>
                   <pic:blipFill>
-                    <a:blip r:embed="rId12"/>
+                    <a:blip r:embed="rId13"/>
                     <a:stretch>
                       <a:fillRect/>
                     </a:stretch>
@@ -631,6 +652,9 @@
     </w:p>
     <w:p>
       <w:r>
+        <w:rPr>
+          <w:noProof/>
+        </w:rPr>
         <w:drawing>
           <wp:inline distT="0" distB="0" distL="0" distR="0" wp14:anchorId="59F119AC" wp14:editId="77AFB5BE">
             <wp:extent cx="5943600" cy="2923540"/>
@@ -647,7 +671,7 @@
                     <pic:cNvPicPr/>
                   </pic:nvPicPr>
                   <pic:blipFill>
-                    <a:blip r:embed="rId13"/>
+                    <a:blip r:embed="rId14"/>
                     <a:stretch>
                       <a:fillRect/>
                     </a:stretch>
@@ -680,25 +704,14 @@
           <w:b/>
           <w:bCs/>
         </w:rPr>
-        <w:t>Trang /Stationeries/</w:t>
-      </w:r>
-      <w:r>
-        <w:rPr>
-          <w:b/>
-          <w:bCs/>
-        </w:rPr>
-        <w:t>Create</w:t>
-      </w:r>
-      <w:r>
-        <w:rPr>
-          <w:b/>
-          <w:bCs/>
-        </w:rPr>
-        <w:t>:</w:t>
-      </w:r>
-    </w:p>
-    <w:p>
-      <w:r>
+        <w:t>Trang /Stationeries/Create:</w:t>
+      </w:r>
+    </w:p>
+    <w:p>
+      <w:r>
+        <w:rPr>
+          <w:noProof/>
+        </w:rPr>
         <w:drawing>
           <wp:inline distT="0" distB="0" distL="0" distR="0" wp14:anchorId="66B76558" wp14:editId="5B28821F">
             <wp:extent cx="5943600" cy="2948940"/>
@@ -715,7 +728,7 @@
                     <pic:cNvPicPr/>
                   </pic:nvPicPr>
                   <pic:blipFill>
-                    <a:blip r:embed="rId14"/>
+                    <a:blip r:embed="rId15"/>
                     <a:stretch>
                       <a:fillRect/>
                     </a:stretch>
@@ -743,6 +756,9 @@
     </w:p>
     <w:p>
       <w:r>
+        <w:rPr>
+          <w:noProof/>
+        </w:rPr>
         <w:lastRenderedPageBreak/>
         <w:drawing>
           <wp:inline distT="0" distB="0" distL="0" distR="0" wp14:anchorId="0AA3859D" wp14:editId="4C0A1AC0">
@@ -760,7 +776,7 @@
                     <pic:cNvPicPr/>
                   </pic:nvPicPr>
                   <pic:blipFill>
-                    <a:blip r:embed="rId15"/>
+                    <a:blip r:embed="rId16"/>
                     <a:stretch>
                       <a:fillRect/>
                     </a:stretch>
@@ -788,6 +804,9 @@
     </w:p>
     <w:p>
       <w:r>
+        <w:rPr>
+          <w:noProof/>
+        </w:rPr>
         <w:drawing>
           <wp:inline distT="0" distB="0" distL="0" distR="0" wp14:anchorId="59FAA66C" wp14:editId="47E3709B">
             <wp:extent cx="5943600" cy="2839720"/>
@@ -804,7 +823,7 @@
                     <pic:cNvPicPr/>
                   </pic:nvPicPr>
                   <pic:blipFill>
-                    <a:blip r:embed="rId16"/>
+                    <a:blip r:embed="rId17"/>
                     <a:stretch>
                       <a:fillRect/>
                     </a:stretch>
@@ -832,6 +851,9 @@
     </w:p>
     <w:p>
       <w:r>
+        <w:rPr>
+          <w:noProof/>
+        </w:rPr>
         <w:lastRenderedPageBreak/>
         <w:drawing>
           <wp:inline distT="0" distB="0" distL="0" distR="0" wp14:anchorId="725E24D8" wp14:editId="3C440716">
@@ -849,7 +871,7 @@
                     <pic:cNvPicPr/>
                   </pic:nvPicPr>
                   <pic:blipFill>
-                    <a:blip r:embed="rId17"/>
+                    <a:blip r:embed="rId18"/>
                     <a:stretch>
                       <a:fillRect/>
                     </a:stretch>
@@ -877,6 +899,9 @@
     </w:p>
     <w:p>
       <w:r>
+        <w:rPr>
+          <w:noProof/>
+        </w:rPr>
         <w:drawing>
           <wp:inline distT="0" distB="0" distL="0" distR="0" wp14:anchorId="7FF9BF38" wp14:editId="76EAEDA9">
             <wp:extent cx="5472752" cy="2693109"/>
@@ -893,7 +918,7 @@
                     <pic:cNvPicPr/>
                   </pic:nvPicPr>
                   <pic:blipFill>
-                    <a:blip r:embed="rId18"/>
+                    <a:blip r:embed="rId19"/>
                     <a:stretch>
                       <a:fillRect/>
                     </a:stretch>
@@ -921,6 +946,9 @@
     </w:p>
     <w:p>
       <w:r>
+        <w:rPr>
+          <w:noProof/>
+        </w:rPr>
         <w:drawing>
           <wp:inline distT="0" distB="0" distL="0" distR="0" wp14:anchorId="4621596E" wp14:editId="6DD3903E">
             <wp:extent cx="5479576" cy="2732177"/>
@@ -937,7 +965,7 @@
                     <pic:cNvPicPr/>
                   </pic:nvPicPr>
                   <pic:blipFill>
-                    <a:blip r:embed="rId19"/>
+                    <a:blip r:embed="rId20"/>
                     <a:stretch>
                       <a:fillRect/>
                     </a:stretch>
@@ -966,6 +994,9 @@
     </w:p>
     <w:p>
       <w:r>
+        <w:rPr>
+          <w:noProof/>
+        </w:rPr>
         <w:drawing>
           <wp:inline distT="0" distB="0" distL="0" distR="0" wp14:anchorId="34505CC1" wp14:editId="4D7EF43E">
             <wp:extent cx="4783540" cy="4605179"/>
@@ -982,7 +1013,7 @@
                     <pic:cNvPicPr/>
                   </pic:nvPicPr>
                   <pic:blipFill>
-                    <a:blip r:embed="rId20"/>
+                    <a:blip r:embed="rId21"/>
                     <a:stretch>
                       <a:fillRect/>
                     </a:stretch>
@@ -1005,6 +1036,9 @@
     </w:p>
     <w:p>
       <w:r>
+        <w:rPr>
+          <w:noProof/>
+        </w:rPr>
         <w:drawing>
           <wp:inline distT="0" distB="0" distL="0" distR="0" wp14:anchorId="6763AD2D" wp14:editId="0003130B">
             <wp:extent cx="4815435" cy="3800901"/>
@@ -1021,7 +1055,7 @@
                     <pic:cNvPicPr/>
                   </pic:nvPicPr>
                   <pic:blipFill>
-                    <a:blip r:embed="rId21"/>
+                    <a:blip r:embed="rId22"/>
                     <a:stretch>
                       <a:fillRect/>
                     </a:stretch>
@@ -1046,6 +1080,9 @@
     <w:p/>
     <w:p>
       <w:r>
+        <w:rPr>
+          <w:noProof/>
+        </w:rPr>
         <w:lastRenderedPageBreak/>
         <w:drawing>
           <wp:inline distT="0" distB="0" distL="0" distR="0" wp14:anchorId="46AB1FC0" wp14:editId="2DEDD6E7">
@@ -1063,7 +1100,7 @@
                     <pic:cNvPicPr/>
                   </pic:nvPicPr>
                   <pic:blipFill>
-                    <a:blip r:embed="rId22"/>
+                    <a:blip r:embed="rId23"/>
                     <a:stretch>
                       <a:fillRect/>
                     </a:stretch>
@@ -1380,13 +1417,7 @@
         <w:t>Ví dụ:</w:t>
       </w:r>
       <w:r>
-        <w:t xml:space="preserve"> Nếu </w:t>
-      </w:r>
-      <w:r>
-        <w:t>ta</w:t>
-      </w:r>
-      <w:r>
-        <w:t xml:space="preserve"> dùng URL cứng </w:t>
+        <w:t xml:space="preserve"> Nếu ta dùng URL cứng </w:t>
       </w:r>
       <w:r>
         <w:rPr>
@@ -1395,7 +1426,10 @@
           <w:sz w:val="24"/>
           <w:szCs w:val="24"/>
         </w:rPr>
-        <w:t>href="/</w:t>
+        <w:t>href="/Stationeries/Details/5"</w:t>
+      </w:r>
+      <w:r>
+        <w:t xml:space="preserve">, URL này sẽ "chết" nếu sau này em muốn đổi đường dẫn thành </w:t>
       </w:r>
       <w:r>
         <w:rPr>
@@ -1404,7 +1438,10 @@
           <w:sz w:val="24"/>
           <w:szCs w:val="24"/>
         </w:rPr>
-        <w:t>Stationeries</w:t>
+        <w:t>/van-phong-pham/chi-tiet/5</w:t>
+      </w:r>
+      <w:r>
+        <w:t xml:space="preserve">. Nếu dùng </w:t>
       </w:r>
       <w:r>
         <w:rPr>
@@ -1413,11 +1450,9 @@
           <w:sz w:val="24"/>
           <w:szCs w:val="24"/>
         </w:rPr>
-        <w:t>/Details/5"</w:t>
-      </w:r>
-      <w:r>
-        <w:t xml:space="preserve">, URL này sẽ "chết" nếu sau này em muốn đổi đường dẫn thành </w:t>
-      </w:r>
+        <w:t>&lt;</w:t>
+      </w:r>
+      <w:proofErr w:type="gramStart"/>
       <w:r>
         <w:rPr>
           <w:rStyle w:val="HTMLCode"/>
@@ -1425,11 +1460,9 @@
           <w:sz w:val="24"/>
           <w:szCs w:val="24"/>
         </w:rPr>
-        <w:t>/van-phong-pham/chi-tiet/5</w:t>
-      </w:r>
-      <w:r>
-        <w:t xml:space="preserve">. Nếu dùng </w:t>
-      </w:r>
+        <w:t>a</w:t>
+      </w:r>
+      <w:proofErr w:type="gramEnd"/>
       <w:r>
         <w:rPr>
           <w:rStyle w:val="HTMLCode"/>
@@ -1437,7 +1470,7 @@
           <w:sz w:val="24"/>
           <w:szCs w:val="24"/>
         </w:rPr>
-        <w:t>&lt;</w:t>
+        <w:t xml:space="preserve"> asp-controller="Stationeries" asp-action="Details" asp-route-id="@</w:t>
       </w:r>
       <w:proofErr w:type="gramStart"/>
       <w:r>
@@ -1447,7 +1480,7 @@
           <w:sz w:val="24"/>
           <w:szCs w:val="24"/>
         </w:rPr>
-        <w:t>a</w:t>
+        <w:t>item.Id</w:t>
       </w:r>
       <w:proofErr w:type="gramEnd"/>
       <w:r>
@@ -1457,7 +1490,10 @@
           <w:sz w:val="24"/>
           <w:szCs w:val="24"/>
         </w:rPr>
-        <w:t xml:space="preserve"> asp-controller="</w:t>
+        <w:t>"&gt;</w:t>
+      </w:r>
+      <w:r>
+        <w:t xml:space="preserve">, hệ thống sẽ tự động cập nhật URL mới trên toàn bộ website theo đúng rule routing mới mà không cần em phải tìm và sửa từng thẻ </w:t>
       </w:r>
       <w:r>
         <w:rPr>
@@ -1466,7 +1502,54 @@
           <w:sz w:val="24"/>
           <w:szCs w:val="24"/>
         </w:rPr>
-        <w:t>Stationeries</w:t>
+        <w:t>&lt;a&gt;</w:t>
+      </w:r>
+      <w:r>
+        <w:t>.</w:t>
+      </w:r>
+    </w:p>
+    <w:p>
+      <w:pPr>
+        <w:numPr>
+          <w:ilvl w:val="0"/>
+          <w:numId w:val="1"/>
+        </w:numPr>
+        <w:rPr>
+          <w:b/>
+          <w:bCs/>
+          <w:highlight w:val="yellow"/>
+        </w:rPr>
+      </w:pPr>
+      <w:r>
+        <w:rPr>
+          <w:b/>
+          <w:bCs/>
+          <w:highlight w:val="yellow"/>
+        </w:rPr>
+        <w:t>Form tìm kiếm nên dùng GET hay POST? Vì sao? </w:t>
+      </w:r>
+    </w:p>
+    <w:p>
+      <w:pPr>
+        <w:pStyle w:val="NormalWeb"/>
+        <w:ind w:left="720"/>
+      </w:pPr>
+      <w:r>
+        <w:t xml:space="preserve">Nên dùng </w:t>
+      </w:r>
+      <w:r>
+        <w:rPr>
+          <w:b/>
+          <w:bCs/>
+        </w:rPr>
+        <w:t>GET</w:t>
+      </w:r>
+      <w:r>
+        <w:t xml:space="preserve"> vì tìm kiếm là hành động truy vấn, không làm thay đổi hay xóa bỏ dữ liệu trên server. Dùng GET sẽ đưa từ khóa lên URL (ví dụ</w:t>
+      </w:r>
+      <w:proofErr w:type="gramStart"/>
+      <w:r>
+        <w:t xml:space="preserve">: </w:t>
       </w:r>
       <w:r>
         <w:rPr>
@@ -1475,9 +1558,9 @@
           <w:sz w:val="24"/>
           <w:szCs w:val="24"/>
         </w:rPr>
-        <w:t>" asp-action="Details" asp-route-id="@</w:t>
-      </w:r>
-      <w:proofErr w:type="gramStart"/>
+        <w:t>?search</w:t>
+      </w:r>
+      <w:proofErr w:type="gramEnd"/>
       <w:r>
         <w:rPr>
           <w:rStyle w:val="HTMLCode"/>
@@ -1485,9 +1568,81 @@
           <w:sz w:val="24"/>
           <w:szCs w:val="24"/>
         </w:rPr>
-        <w:t>item.Id</w:t>
-      </w:r>
-      <w:proofErr w:type="gramEnd"/>
+        <w:t>=bút+highlight</w:t>
+      </w:r>
+      <w:r>
+        <w:t>). Điều này cho phép người dùng lưu lại bookmark kết quả tìm kiếm, gửi link cho bạn bè, và giúp trình duyệt có thể cache lại kết quả nếu cần.</w:t>
+      </w:r>
+    </w:p>
+    <w:p>
+      <w:pPr>
+        <w:numPr>
+          <w:ilvl w:val="0"/>
+          <w:numId w:val="1"/>
+        </w:numPr>
+        <w:rPr>
+          <w:b/>
+          <w:bCs/>
+          <w:highlight w:val="yellow"/>
+        </w:rPr>
+      </w:pPr>
+      <w:r>
+        <w:rPr>
+          <w:b/>
+          <w:bCs/>
+          <w:highlight w:val="yellow"/>
+        </w:rPr>
+        <w:t>Form thêm dữ liệu nên dùng GET hay POST? Vì sao? </w:t>
+      </w:r>
+    </w:p>
+    <w:p>
+      <w:pPr>
+        <w:pStyle w:val="NormalWeb"/>
+        <w:ind w:left="720"/>
+      </w:pPr>
+      <w:r>
+        <w:t xml:space="preserve">Nên dùng </w:t>
+      </w:r>
+      <w:r>
+        <w:rPr>
+          <w:b/>
+          <w:bCs/>
+        </w:rPr>
+        <w:t>POST</w:t>
+      </w:r>
+      <w:r>
+        <w:t xml:space="preserve"> vì hành động "Thêm sản phẩm mới" làm thay đổi trạng thái và dữ liệu của hệ thống. POST gửi dữ liệu ngầm trong HTTP Body giúp bảo mật tốt hơn, truyền được lượng dữ liệu lớn (như file hình ảnh của sản phẩm) và trình duyệt sẽ hiển thị cảnh báo nếu người dùng lỡ tay ấn F5 (tránh việc vô tình submit tạo ra hai sản phẩm trùng nhau).</w:t>
+      </w:r>
+    </w:p>
+    <w:p>
+      <w:pPr>
+        <w:numPr>
+          <w:ilvl w:val="0"/>
+          <w:numId w:val="1"/>
+        </w:numPr>
+        <w:rPr>
+          <w:b/>
+          <w:bCs/>
+          <w:highlight w:val="yellow"/>
+        </w:rPr>
+      </w:pPr>
+      <w:r>
+        <w:rPr>
+          <w:b/>
+          <w:bCs/>
+          <w:highlight w:val="yellow"/>
+        </w:rPr>
+        <w:t>Model Binding hoạt động như thế nào trong form Create của em? Hãy giải thích mối liên hệ giữa asp-for, tên property trong ViewModel và dữ liệu action nhận được. </w:t>
+      </w:r>
+    </w:p>
+    <w:p>
+      <w:pPr>
+        <w:pStyle w:val="NormalWeb"/>
+        <w:ind w:left="720"/>
+      </w:pPr>
+      <w:r>
+        <w:t xml:space="preserve">Khi ta dùng </w:t>
+      </w:r>
       <w:r>
         <w:rPr>
           <w:rStyle w:val="HTMLCode"/>
@@ -1495,10 +1650,10 @@
           <w:sz w:val="24"/>
           <w:szCs w:val="24"/>
         </w:rPr>
-        <w:t>"&gt;</w:t>
-      </w:r>
-      <w:r>
-        <w:t xml:space="preserve">, hệ thống sẽ tự động cập nhật URL mới trên toàn bộ website theo đúng rule routing mới mà không cần em phải tìm và sửa từng thẻ </w:t>
+        <w:t>asp-for="StationerytName"</w:t>
+      </w:r>
+      <w:r>
+        <w:t xml:space="preserve"> trong view, ASP.NET Core tự động sinh ra thẻ </w:t>
       </w:r>
       <w:r>
         <w:rPr>
@@ -1507,31 +1662,10 @@
           <w:sz w:val="24"/>
           <w:szCs w:val="24"/>
         </w:rPr>
-        <w:t>&lt;a&gt;</w:t>
+        <w:t>&lt;input type="text" id="StationeryName" name="StationeryName"&gt;</w:t>
       </w:r>
       <w:r>
         <w:t>.</w:t>
-      </w:r>
-    </w:p>
-    <w:p>
-      <w:pPr>
-        <w:numPr>
-          <w:ilvl w:val="0"/>
-          <w:numId w:val="1"/>
-        </w:numPr>
-        <w:rPr>
-          <w:b/>
-          <w:bCs/>
-          <w:highlight w:val="yellow"/>
-        </w:rPr>
-      </w:pPr>
-      <w:r>
-        <w:rPr>
-          <w:b/>
-          <w:bCs/>
-          <w:highlight w:val="yellow"/>
-        </w:rPr>
-        <w:t>Form tìm kiếm nên dùng GET hay POST? Vì sao? </w:t>
       </w:r>
     </w:p>
     <w:p>
@@ -1540,24 +1674,14 @@
         <w:ind w:left="720"/>
       </w:pPr>
       <w:r>
-        <w:t xml:space="preserve">Nên dùng </w:t>
-      </w:r>
-      <w:r>
-        <w:rPr>
-          <w:b/>
-          <w:bCs/>
-        </w:rPr>
-        <w:t>GET</w:t>
-      </w:r>
-      <w:r>
-        <w:t xml:space="preserve"> vì t</w:t>
-      </w:r>
-      <w:r>
-        <w:t>ìm kiếm là hành động truy vấn, không làm thay đổi hay xóa bỏ dữ liệu trên server. Dùng GET sẽ đưa từ khóa lên URL (ví dụ</w:t>
-      </w:r>
-      <w:proofErr w:type="gramStart"/>
-      <w:r>
-        <w:t xml:space="preserve">: </w:t>
+        <w:rPr>
+          <w:b/>
+          <w:bCs/>
+        </w:rPr>
+        <w:t>Mối liên hệ:</w:t>
+      </w:r>
+      <w:r>
+        <w:t xml:space="preserve"> Khi form được submit (POST), Model Binder của framework sẽ quét qua toàn bộ các key-value trong HTTP Request (Form Data). Nó tìm các </w:t>
       </w:r>
       <w:r>
         <w:rPr>
@@ -1566,9 +1690,11 @@
           <w:sz w:val="24"/>
           <w:szCs w:val="24"/>
         </w:rPr>
-        <w:t>?search</w:t>
-      </w:r>
-      <w:proofErr w:type="gramEnd"/>
+        <w:t>name</w:t>
+      </w:r>
+      <w:r>
+        <w:t xml:space="preserve"> trùng khớp với tên thuộc tính trong ViewModel (không phân biệt hoa thường). Nếu thấy key </w:t>
+      </w:r>
       <w:r>
         <w:rPr>
           <w:rStyle w:val="HTMLCode"/>
@@ -1576,89 +1702,10 @@
           <w:sz w:val="24"/>
           <w:szCs w:val="24"/>
         </w:rPr>
-        <w:t>=bút+highlight</w:t>
-      </w:r>
-      <w:r>
-        <w:t>). Điều này cho phép người dùng lưu lại bookmark kết quả tìm kiếm, gửi link cho bạn bè, và giúp trình duyệt có thể cache lại kết quả nếu cần.</w:t>
-      </w:r>
-    </w:p>
-    <w:p>
-      <w:pPr>
-        <w:numPr>
-          <w:ilvl w:val="0"/>
-          <w:numId w:val="1"/>
-        </w:numPr>
-        <w:rPr>
-          <w:b/>
-          <w:bCs/>
-          <w:highlight w:val="yellow"/>
-        </w:rPr>
-      </w:pPr>
-      <w:r>
-        <w:rPr>
-          <w:b/>
-          <w:bCs/>
-          <w:highlight w:val="yellow"/>
-        </w:rPr>
-        <w:t>Form thêm dữ liệu nên dùng GET hay POST? Vì sao? </w:t>
-      </w:r>
-    </w:p>
-    <w:p>
-      <w:pPr>
-        <w:pStyle w:val="NormalWeb"/>
-        <w:ind w:left="720"/>
-      </w:pPr>
-      <w:r>
-        <w:t xml:space="preserve">Nên dùng </w:t>
-      </w:r>
-      <w:r>
-        <w:rPr>
-          <w:b/>
-          <w:bCs/>
-        </w:rPr>
-        <w:t>POST</w:t>
-      </w:r>
-      <w:r>
-        <w:t xml:space="preserve"> vì h</w:t>
-      </w:r>
-      <w:r>
-        <w:t>ành động "Thêm sản phẩm mới" làm thay đổi trạng thái và dữ liệu của hệ thống. POST gửi dữ liệu ngầm trong HTTP Body giúp bảo mật tốt hơn, truyền được lượng dữ liệu lớn (như file hình ảnh của sản phẩm) và trình duyệt sẽ hiển thị cảnh báo nếu người dùng lỡ tay ấn F5 (tránh việc vô tình submit tạo ra hai sản phẩm trùng nhau).</w:t>
-      </w:r>
-    </w:p>
-    <w:p>
-      <w:pPr>
-        <w:numPr>
-          <w:ilvl w:val="0"/>
-          <w:numId w:val="1"/>
-        </w:numPr>
-        <w:rPr>
-          <w:b/>
-          <w:bCs/>
-          <w:highlight w:val="yellow"/>
-        </w:rPr>
-      </w:pPr>
-      <w:r>
-        <w:rPr>
-          <w:b/>
-          <w:bCs/>
-          <w:highlight w:val="yellow"/>
-        </w:rPr>
-        <w:t>Model Binding hoạt động như thế nào trong form Create của em? Hãy giải thích mối liên hệ giữa asp-for, tên property trong ViewModel và dữ liệu action nhận được. </w:t>
-      </w:r>
-    </w:p>
-    <w:p>
-      <w:pPr>
-        <w:pStyle w:val="NormalWeb"/>
-        <w:ind w:left="720"/>
-      </w:pPr>
-      <w:r>
-        <w:t xml:space="preserve">Khi </w:t>
-      </w:r>
-      <w:r>
-        <w:t>ta</w:t>
-      </w:r>
-      <w:r>
-        <w:t xml:space="preserve"> dùng </w:t>
+        <w:t>StationeryName</w:t>
+      </w:r>
+      <w:r>
+        <w:t xml:space="preserve"> có giá trị là "Blue Ballpoint Pen", nó sẽ tự động gán giá trị đó vào property </w:t>
       </w:r>
       <w:r>
         <w:rPr>
@@ -1667,140 +1714,7 @@
           <w:sz w:val="24"/>
           <w:szCs w:val="24"/>
         </w:rPr>
-        <w:t>asp-for="</w:t>
-      </w:r>
-      <w:r>
-        <w:rPr>
-          <w:rStyle w:val="HTMLCode"/>
-          <w:rFonts w:ascii="Times New Roman" w:hAnsi="Times New Roman" w:cs="Times New Roman"/>
-          <w:sz w:val="24"/>
-          <w:szCs w:val="24"/>
-        </w:rPr>
-        <w:t>Stationery</w:t>
-      </w:r>
-      <w:r>
-        <w:rPr>
-          <w:rStyle w:val="HTMLCode"/>
-          <w:rFonts w:ascii="Times New Roman" w:hAnsi="Times New Roman" w:cs="Times New Roman"/>
-          <w:sz w:val="24"/>
-          <w:szCs w:val="24"/>
-        </w:rPr>
-        <w:t>tName"</w:t>
-      </w:r>
-      <w:r>
-        <w:t xml:space="preserve"> trong view, ASP.NET Core tự động sinh ra thẻ </w:t>
-      </w:r>
-      <w:r>
-        <w:rPr>
-          <w:rStyle w:val="HTMLCode"/>
-          <w:rFonts w:ascii="Times New Roman" w:hAnsi="Times New Roman" w:cs="Times New Roman"/>
-          <w:sz w:val="24"/>
-          <w:szCs w:val="24"/>
-        </w:rPr>
-        <w:t>&lt;input type="text" id="</w:t>
-      </w:r>
-      <w:r>
-        <w:rPr>
-          <w:rStyle w:val="HTMLCode"/>
-          <w:rFonts w:ascii="Times New Roman" w:hAnsi="Times New Roman" w:cs="Times New Roman"/>
-          <w:sz w:val="24"/>
-          <w:szCs w:val="24"/>
-        </w:rPr>
-        <w:t>Stationery</w:t>
-      </w:r>
-      <w:r>
-        <w:rPr>
-          <w:rStyle w:val="HTMLCode"/>
-          <w:rFonts w:ascii="Times New Roman" w:hAnsi="Times New Roman" w:cs="Times New Roman"/>
-          <w:sz w:val="24"/>
-          <w:szCs w:val="24"/>
-        </w:rPr>
-        <w:t>Name" name="</w:t>
-      </w:r>
-      <w:r>
-        <w:rPr>
-          <w:rStyle w:val="HTMLCode"/>
-          <w:rFonts w:ascii="Times New Roman" w:hAnsi="Times New Roman" w:cs="Times New Roman"/>
-          <w:sz w:val="24"/>
-          <w:szCs w:val="24"/>
-        </w:rPr>
-        <w:t>Stationery</w:t>
-      </w:r>
-      <w:r>
-        <w:rPr>
-          <w:rStyle w:val="HTMLCode"/>
-          <w:rFonts w:ascii="Times New Roman" w:hAnsi="Times New Roman" w:cs="Times New Roman"/>
-          <w:sz w:val="24"/>
-          <w:szCs w:val="24"/>
-        </w:rPr>
-        <w:t>Name"&gt;</w:t>
-      </w:r>
-      <w:r>
-        <w:t>.</w:t>
-      </w:r>
-    </w:p>
-    <w:p>
-      <w:pPr>
-        <w:pStyle w:val="NormalWeb"/>
-        <w:ind w:left="720"/>
-      </w:pPr>
-      <w:r>
-        <w:rPr>
-          <w:b/>
-          <w:bCs/>
-        </w:rPr>
-        <w:t>Mối liên hệ:</w:t>
-      </w:r>
-      <w:r>
-        <w:t xml:space="preserve"> Khi form được submit (POST), Model Binder của framework sẽ quét qua toàn bộ các key-value trong HTTP Request (Form Data). Nó tìm các </w:t>
-      </w:r>
-      <w:r>
-        <w:rPr>
-          <w:rStyle w:val="HTMLCode"/>
-          <w:rFonts w:ascii="Times New Roman" w:hAnsi="Times New Roman" w:cs="Times New Roman"/>
-          <w:sz w:val="24"/>
-          <w:szCs w:val="24"/>
-        </w:rPr>
-        <w:t>name</w:t>
-      </w:r>
-      <w:r>
-        <w:t xml:space="preserve"> trùng khớp với tên thuộc tính trong ViewModel (không phân biệt hoa thường). Nếu thấy key </w:t>
-      </w:r>
-      <w:r>
-        <w:rPr>
-          <w:rStyle w:val="HTMLCode"/>
-          <w:rFonts w:ascii="Times New Roman" w:hAnsi="Times New Roman" w:cs="Times New Roman"/>
-          <w:sz w:val="24"/>
-          <w:szCs w:val="24"/>
-        </w:rPr>
         <w:t>StationeryName</w:t>
-      </w:r>
-      <w:r>
-        <w:t xml:space="preserve"> có giá trị là "</w:t>
-      </w:r>
-      <w:r>
-        <w:t>Blue Ballpoint Pen</w:t>
-      </w:r>
-      <w:r>
-        <w:t xml:space="preserve">", nó sẽ tự động gán giá trị đó vào property </w:t>
-      </w:r>
-      <w:r>
-        <w:rPr>
-          <w:rStyle w:val="HTMLCode"/>
-          <w:rFonts w:ascii="Times New Roman" w:hAnsi="Times New Roman" w:cs="Times New Roman"/>
-          <w:sz w:val="24"/>
-          <w:szCs w:val="24"/>
-        </w:rPr>
-        <w:t>Stationery</w:t>
-      </w:r>
-      <w:r>
-        <w:rPr>
-          <w:rStyle w:val="HTMLCode"/>
-          <w:rFonts w:ascii="Times New Roman" w:hAnsi="Times New Roman" w:cs="Times New Roman"/>
-          <w:sz w:val="24"/>
-          <w:szCs w:val="24"/>
-        </w:rPr>
-        <w:t>Name</w:t>
       </w:r>
       <w:r>
         <w:t xml:space="preserve"> của tham số Model mà Action trong Controller đang chờ nhận.</w:t>
@@ -3061,6 +2975,7 @@
   <w:style w:type="character" w:default="1" w:styleId="DefaultParagraphFont">
     <w:name w:val="Default Paragraph Font"/>
     <w:uiPriority w:val="1"/>
+    <w:semiHidden/>
     <w:unhideWhenUsed/>
   </w:style>
   <w:style w:type="table" w:default="1" w:styleId="TableNormal">
@@ -3402,6 +3317,29 @@
       <w:szCs w:val="20"/>
     </w:rPr>
   </w:style>
+  <w:style w:type="character" w:styleId="Hyperlink">
+    <w:name w:val="Hyperlink"/>
+    <w:basedOn w:val="DefaultParagraphFont"/>
+    <w:uiPriority w:val="99"/>
+    <w:unhideWhenUsed/>
+    <w:rsid w:val="00982649"/>
+    <w:rPr>
+      <w:color w:val="467886" w:themeColor="hyperlink"/>
+      <w:u w:val="single"/>
+    </w:rPr>
+  </w:style>
+  <w:style w:type="character" w:styleId="UnresolvedMention">
+    <w:name w:val="Unresolved Mention"/>
+    <w:basedOn w:val="DefaultParagraphFont"/>
+    <w:uiPriority w:val="99"/>
+    <w:semiHidden/>
+    <w:unhideWhenUsed/>
+    <w:rsid w:val="00982649"/>
+    <w:rPr>
+      <w:color w:val="605E5C"/>
+      <w:shd w:val="clear" w:color="auto" w:fill="E1DFDD"/>
+    </w:rPr>
+  </w:style>
 </w:styles>
 </file>
 

</xml_diff>